<commit_message>
docs: add editable architecture diagrams and updated solution draft
</commit_message>
<xml_diff>
--- a/docs/Fleet_Intelligence_Solution_Document_DRAFT.docx
+++ b/docs/Fleet_Intelligence_Solution_Document_DRAFT.docx
@@ -2835,7 +2835,7 @@
         <w:spacing w:before="60" w:after="200" w:line="300" w:lineRule="auto"/>
       </w:pPr>
       <w:r>
-        <w:t>[DIAGRAM PLACEHOLDERS — to be added after remaining technical work, as requested: C4 context; C4 container with protocols; one-event data-flow with measured per-hop latency. The current implemented path is simulator → Spring Boot API → Kafka → PostgreSQL operational consumer and ClickHouse analytics consumer → REST API → React dashboard. Do not interpret the intended architecture diagram in docs/ARCHITECTURE.md as deployed cloud infrastructure.]</w:t>
+        <w:t>Current implemented architecture diagrams are provided in the landscape Appendix A: system context, containers, and event data flow. Per-hop latency remains unmeasured; case-study limits are labeled as targets.</w:t>
       </w:r>
     </w:p>
     <w:p>
@@ -4018,7 +4018,7 @@
         <w:spacing w:before="60" w:after="200" w:line="300" w:lineRule="auto"/>
       </w:pPr>
       <w:r>
-        <w:t>Current deployment is a local Docker Compose demonstration: API, React dashboard, PostgreSQL, single-node Kafka, ClickHouse, and optional Python simulator. Compose configuration was checked; a live recheck returned API readiness UP and dashboard HTTP 200. A 100K-vehicle overview was returned. Cloud clusters, namespaces, replicas, autoscaling, production networking, managed secrets, TLS, and multi-zone failover are not deployed or verified. [ADD DEPLOYMENT DIAGRAM AND SELECTED CLOUD DETAILS IF COMPLETED.]</w:t>
+        <w:t>The deployment view is provided in Appendix A. It distinguishes the current one-machine Compose demo from an unimplemented high-availability reference topology.</w:t>
       </w:r>
     </w:p>
     <w:p>
@@ -4071,14 +4071,7 @@
         <w:spacing w:after="90" w:line="290" w:lineRule="auto"/>
       </w:pPr>
       <w:r>
-        <w:rPr>
-          <w:b/>
-          <w:bCs/>
-        </w:rPr>
-        <w:t xml:space="preserve">Layer Diagram: </w:t>
-      </w:r>
-      <w:r>
-        <w:t>Internal layers of at least one core service and the allowed dependency direction</w:t>
+        <w:t>Layer Diagram: See Appendix A for the service layers and intended dependency direction.</w:t>
       </w:r>
     </w:p>
     <w:p>
@@ -5222,7 +5215,7 @@
         <w:spacing w:before="60" w:after="200" w:line="300" w:lineRule="auto"/>
       </w:pPr>
       <w:r>
-        <w:t>Contracts: REST endpoints are versioned under /v1; telemetry ingest returns 202 after Kafka acknowledgement; tenant-scoped reads use tenant_id and secured API mode enforces JWT scope/tenant claims. Kafka telemetry is JSON keyed by tenant and vehicle. [LINK GENERATED OPENAPI AND DOCUMENT EVENT SCHEMA / COMPATIBILITY POLICY.] Flow A: event → validation → Kafka acknowledgement → consumers → operational/analytical views. Flow B: prolonged idle → persisted alert → dashboard review/acknowledgement → movement resolves the episode. Failure/retry/dead-letter behavior exists in the consumer path; [ADD SEQUENCE DIAGRAM AND measured duplicate/broker-failure results.]</w:t>
+        <w:t>Contracts: REST endpoints are versioned under /v1; telemetry ingest returns 202 after Kafka acknowledgement; tenant-scoped reads use tenant_id and secured API mode enforces JWT scope/tenant claims. Kafka telemetry is JSON keyed by tenant and vehicle. [LINK GENERATED OPENAPI AND DOCUMENT EVENT SCHEMA / COMPATIBILITY POLICY.] Flow A: event → validation → Kafka acknowledgement → consumers → operational/analytical views. Flow B: prolonged idle → persisted alert → dashboard review/acknowledgement → movement resolves the episode. Failure/retry/dead-letter behavior exists in the consumer path. See Appendix A for both sequence diagrams; measured duplicate/broker-failure results remain pending.</w:t>
       </w:r>
     </w:p>
     <w:p>
@@ -8450,7 +8443,7 @@
         <w:spacing w:after="90" w:line="290" w:lineRule="auto"/>
       </w:pPr>
       <w:r>
-        <w:t>Additional diagrams or flowcharts</w:t>
+        <w:t>Additional architecture, deployment, ER, layering, and sequence diagrams: see landscape Appendix A following the template pages.</w:t>
       </w:r>
     </w:p>
     <w:p>
@@ -8481,11 +8474,506 @@
         <w:t>References or external sources</w:t>
       </w:r>
     </w:p>
+    <w:p>
+      <w:pPr>
+        <w:sectPr>
+          <w:headerReference w:type="default" r:id="rId7"/>
+          <w:footerReference w:type="default" r:id="rId8"/>
+          <w:pgSz w:w="11906" w:h="16838"/>
+          <w:pgMar w:top="1440" w:right="1300" w:bottom="1300" w:left="1300" w:header="600" w:footer="600" w:gutter="0"/>
+          <w:cols w:space="720"/>
+          <w:docGrid w:linePitch="360"/>
+        </w:sectPr>
+      </w:pPr>
+    </w:p>
+    <w:p>
+      <w:pPr>
+        <w:pStyle w:val="Heading1"/>
+      </w:pPr>
+      <w:r>
+        <w:t>Appendix A — Architecture and Data Diagrams</w:t>
+      </w:r>
+    </w:p>
+    <w:p>
+      <w:r>
+        <w:t>Editable source: tldraw board “Fleet Intelligence Platform — Hackathon Architecture &amp; Data Diagrams”. Implemented components reflect the local demo. Any future integrations or high-availability topology are explicitly marked as planned, not deployed. Latency figures are targets only until measured.</w:t>
+      </w:r>
+    </w:p>
+    <w:p>
+      <w:pPr>
+        <w:pStyle w:val="Heading2"/>
+        <w:keepNext/>
+        <w:pageBreakBefore/>
+      </w:pPr>
+      <w:r>
+        <w:t>A1. C4 system context</w:t>
+      </w:r>
+    </w:p>
+    <w:p>
+      <w:pPr>
+        <w:keepLines/>
+        <w:jc w:val="center"/>
+      </w:pPr>
+      <w:r>
+        <w:drawing>
+          <wp:inline xmlns:a="http://schemas.openxmlformats.org/drawingml/2006/main" xmlns:pic="http://schemas.openxmlformats.org/drawingml/2006/picture">
+            <wp:extent cx="9006840" cy="5563199"/>
+            <wp:docPr id="1" name="Picture 1"/>
+            <wp:cNvGraphicFramePr>
+              <a:graphicFrameLocks noChangeAspect="1"/>
+            </wp:cNvGraphicFramePr>
+            <a:graphic>
+              <a:graphicData uri="http://schemas.openxmlformats.org/drawingml/2006/picture">
+                <pic:pic>
+                  <pic:nvPicPr>
+                    <pic:cNvPr id="0" name="01-c4-context.png"/>
+                    <pic:cNvPicPr/>
+                  </pic:nvPicPr>
+                  <pic:blipFill>
+                    <a:blip r:embed="rId11"/>
+                    <a:stretch>
+                      <a:fillRect/>
+                    </a:stretch>
+                  </pic:blipFill>
+                  <pic:spPr>
+                    <a:xfrm>
+                      <a:off x="0" y="0"/>
+                      <a:ext cx="9006840" cy="5563199"/>
+                    </a:xfrm>
+                    <a:prstGeom prst="rect"/>
+                  </pic:spPr>
+                </pic:pic>
+              </a:graphicData>
+            </a:graphic>
+          </wp:inline>
+        </w:drawing>
+      </w:r>
+    </w:p>
+    <w:p>
+      <w:pPr>
+        <w:keepLines/>
+        <w:jc w:val="center"/>
+      </w:pPr>
+      <w:r>
+        <w:t>Fleet manager, simulator, platform boundary, and external integrations not connected in the demo.</w:t>
+      </w:r>
+    </w:p>
+    <w:p>
+      <w:pPr>
+        <w:pStyle w:val="Heading2"/>
+        <w:keepNext/>
+        <w:pageBreakBefore/>
+      </w:pPr>
+      <w:r>
+        <w:t>A2. C4 containers</w:t>
+      </w:r>
+    </w:p>
+    <w:p>
+      <w:pPr>
+        <w:keepLines/>
+        <w:jc w:val="center"/>
+      </w:pPr>
+      <w:r>
+        <w:drawing>
+          <wp:inline xmlns:a="http://schemas.openxmlformats.org/drawingml/2006/main" xmlns:pic="http://schemas.openxmlformats.org/drawingml/2006/picture">
+            <wp:extent cx="9006840" cy="2233839"/>
+            <wp:docPr id="2" name="Picture 2"/>
+            <wp:cNvGraphicFramePr>
+              <a:graphicFrameLocks noChangeAspect="1"/>
+            </wp:cNvGraphicFramePr>
+            <a:graphic>
+              <a:graphicData uri="http://schemas.openxmlformats.org/drawingml/2006/picture">
+                <pic:pic>
+                  <pic:nvPicPr>
+                    <pic:cNvPr id="0" name="02-c4-containers.png"/>
+                    <pic:cNvPicPr/>
+                  </pic:nvPicPr>
+                  <pic:blipFill>
+                    <a:blip r:embed="rId12"/>
+                    <a:stretch>
+                      <a:fillRect/>
+                    </a:stretch>
+                  </pic:blipFill>
+                  <pic:spPr>
+                    <a:xfrm>
+                      <a:off x="0" y="0"/>
+                      <a:ext cx="9006840" cy="2233839"/>
+                    </a:xfrm>
+                    <a:prstGeom prst="rect"/>
+                  </pic:spPr>
+                </pic:pic>
+              </a:graphicData>
+            </a:graphic>
+          </wp:inline>
+        </w:drawing>
+      </w:r>
+    </w:p>
+    <w:p>
+      <w:pPr>
+        <w:keepLines/>
+        <w:jc w:val="center"/>
+      </w:pPr>
+      <w:r>
+        <w:t>Current services, stores, protocols, event routes, and dead-letter handling.</w:t>
+      </w:r>
+    </w:p>
+    <w:p>
+      <w:pPr>
+        <w:pStyle w:val="Heading2"/>
+        <w:keepNext/>
+        <w:pageBreakBefore/>
+      </w:pPr>
+      <w:r>
+        <w:t>A3. Telemetry event flow</w:t>
+      </w:r>
+    </w:p>
+    <w:p>
+      <w:pPr>
+        <w:keepLines/>
+        <w:jc w:val="center"/>
+      </w:pPr>
+      <w:r>
+        <w:drawing>
+          <wp:inline xmlns:a="http://schemas.openxmlformats.org/drawingml/2006/main" xmlns:pic="http://schemas.openxmlformats.org/drawingml/2006/picture">
+            <wp:extent cx="9006840" cy="2284117"/>
+            <wp:docPr id="3" name="Picture 3"/>
+            <wp:cNvGraphicFramePr>
+              <a:graphicFrameLocks noChangeAspect="1"/>
+            </wp:cNvGraphicFramePr>
+            <a:graphic>
+              <a:graphicData uri="http://schemas.openxmlformats.org/drawingml/2006/picture">
+                <pic:pic>
+                  <pic:nvPicPr>
+                    <pic:cNvPr id="0" name="03-event-data-flow.png"/>
+                    <pic:cNvPicPr/>
+                  </pic:nvPicPr>
+                  <pic:blipFill>
+                    <a:blip r:embed="rId13"/>
+                    <a:stretch>
+                      <a:fillRect/>
+                    </a:stretch>
+                  </pic:blipFill>
+                  <pic:spPr>
+                    <a:xfrm>
+                      <a:off x="0" y="0"/>
+                      <a:ext cx="9006840" cy="2284117"/>
+                    </a:xfrm>
+                    <a:prstGeom prst="rect"/>
+                  </pic:spPr>
+                </pic:pic>
+              </a:graphicData>
+            </a:graphic>
+          </wp:inline>
+        </w:drawing>
+      </w:r>
+    </w:p>
+    <w:p>
+      <w:pPr>
+        <w:keepLines/>
+        <w:jc w:val="center"/>
+      </w:pPr>
+      <w:r>
+        <w:t>Per-hop latency is marked TBD; dashboard and critical-alert values are challenge targets.</w:t>
+      </w:r>
+    </w:p>
+    <w:p>
+      <w:pPr>
+        <w:pStyle w:val="Heading2"/>
+        <w:keepNext/>
+        <w:pageBreakBefore/>
+      </w:pPr>
+      <w:r>
+        <w:t>A4. Relational ER and tenant ownership</w:t>
+      </w:r>
+    </w:p>
+    <w:p>
+      <w:pPr>
+        <w:keepLines/>
+        <w:jc w:val="center"/>
+      </w:pPr>
+      <w:r>
+        <w:drawing>
+          <wp:inline xmlns:a="http://schemas.openxmlformats.org/drawingml/2006/main" xmlns:pic="http://schemas.openxmlformats.org/drawingml/2006/picture">
+            <wp:extent cx="5338220" cy="5623559"/>
+            <wp:docPr id="4" name="Picture 4"/>
+            <wp:cNvGraphicFramePr>
+              <a:graphicFrameLocks noChangeAspect="1"/>
+            </wp:cNvGraphicFramePr>
+            <a:graphic>
+              <a:graphicData uri="http://schemas.openxmlformats.org/drawingml/2006/picture">
+                <pic:pic>
+                  <pic:nvPicPr>
+                    <pic:cNvPr id="0" name="04-er-tenant-ownership.png"/>
+                    <pic:cNvPicPr/>
+                  </pic:nvPicPr>
+                  <pic:blipFill>
+                    <a:blip r:embed="rId14"/>
+                    <a:stretch>
+                      <a:fillRect/>
+                    </a:stretch>
+                  </pic:blipFill>
+                  <pic:spPr>
+                    <a:xfrm>
+                      <a:off x="0" y="0"/>
+                      <a:ext cx="5338220" cy="5623559"/>
+                    </a:xfrm>
+                    <a:prstGeom prst="rect"/>
+                  </pic:spPr>
+                </pic:pic>
+              </a:graphicData>
+            </a:graphic>
+          </wp:inline>
+        </w:drawing>
+      </w:r>
+    </w:p>
+    <w:p>
+      <w:pPr>
+        <w:keepLines/>
+        <w:jc w:val="center"/>
+      </w:pPr>
+      <w:r>
+        <w:t>Post-V6 tenant and vehicle ownership, operational projections, and telemetry/fuel relationships.</w:t>
+      </w:r>
+    </w:p>
+    <w:p>
+      <w:pPr>
+        <w:pStyle w:val="Heading2"/>
+        <w:keepNext/>
+        <w:pageBreakBefore/>
+      </w:pPr>
+      <w:r>
+        <w:t>A5. Deployment view</w:t>
+      </w:r>
+    </w:p>
+    <w:p>
+      <w:pPr>
+        <w:keepLines/>
+        <w:jc w:val="center"/>
+      </w:pPr>
+      <w:r>
+        <w:drawing>
+          <wp:inline xmlns:a="http://schemas.openxmlformats.org/drawingml/2006/main" xmlns:pic="http://schemas.openxmlformats.org/drawingml/2006/picture">
+            <wp:extent cx="9006840" cy="4659944"/>
+            <wp:docPr id="5" name="Picture 5"/>
+            <wp:cNvGraphicFramePr>
+              <a:graphicFrameLocks noChangeAspect="1"/>
+            </wp:cNvGraphicFramePr>
+            <a:graphic>
+              <a:graphicData uri="http://schemas.openxmlformats.org/drawingml/2006/picture">
+                <pic:pic>
+                  <pic:nvPicPr>
+                    <pic:cNvPr id="0" name="05-deployment.png"/>
+                    <pic:cNvPicPr/>
+                  </pic:nvPicPr>
+                  <pic:blipFill>
+                    <a:blip r:embed="rId15"/>
+                    <a:stretch>
+                      <a:fillRect/>
+                    </a:stretch>
+                  </pic:blipFill>
+                  <pic:spPr>
+                    <a:xfrm>
+                      <a:off x="0" y="0"/>
+                      <a:ext cx="9006840" cy="4659944"/>
+                    </a:xfrm>
+                    <a:prstGeom prst="rect"/>
+                  </pic:spPr>
+                </pic:pic>
+              </a:graphicData>
+            </a:graphic>
+          </wp:inline>
+        </w:drawing>
+      </w:r>
+    </w:p>
+    <w:p>
+      <w:pPr>
+        <w:keepLines/>
+        <w:jc w:val="center"/>
+      </w:pPr>
+      <w:r>
+        <w:t>Current local Compose topology beside a proposed HA target that is not deployed or verified.</w:t>
+      </w:r>
+    </w:p>
+    <w:p>
+      <w:pPr>
+        <w:pStyle w:val="Heading2"/>
+        <w:keepNext/>
+        <w:pageBreakBefore/>
+      </w:pPr>
+      <w:r>
+        <w:t>A6. Service layers</w:t>
+      </w:r>
+    </w:p>
+    <w:p>
+      <w:pPr>
+        <w:keepLines/>
+        <w:jc w:val="center"/>
+      </w:pPr>
+      <w:r>
+        <w:drawing>
+          <wp:inline xmlns:a="http://schemas.openxmlformats.org/drawingml/2006/main" xmlns:pic="http://schemas.openxmlformats.org/drawingml/2006/picture">
+            <wp:extent cx="4483440" cy="5623559"/>
+            <wp:docPr id="6" name="Picture 6"/>
+            <wp:cNvGraphicFramePr>
+              <a:graphicFrameLocks noChangeAspect="1"/>
+            </wp:cNvGraphicFramePr>
+            <a:graphic>
+              <a:graphicData uri="http://schemas.openxmlformats.org/drawingml/2006/picture">
+                <pic:pic>
+                  <pic:nvPicPr>
+                    <pic:cNvPr id="0" name="06-service-layers.png"/>
+                    <pic:cNvPicPr/>
+                  </pic:nvPicPr>
+                  <pic:blipFill>
+                    <a:blip r:embed="rId16"/>
+                    <a:stretch>
+                      <a:fillRect/>
+                    </a:stretch>
+                  </pic:blipFill>
+                  <pic:spPr>
+                    <a:xfrm>
+                      <a:off x="0" y="0"/>
+                      <a:ext cx="4483440" cy="5623559"/>
+                    </a:xfrm>
+                    <a:prstGeom prst="rect"/>
+                  </pic:spPr>
+                </pic:pic>
+              </a:graphicData>
+            </a:graphic>
+          </wp:inline>
+        </w:drawing>
+      </w:r>
+    </w:p>
+    <w:p>
+      <w:pPr>
+        <w:keepLines/>
+        <w:jc w:val="center"/>
+      </w:pPr>
+      <w:r>
+        <w:t>Intended presentation, application, domain, and infrastructure responsibilities.</w:t>
+      </w:r>
+    </w:p>
+    <w:p>
+      <w:pPr>
+        <w:pStyle w:val="Heading2"/>
+        <w:keepNext/>
+        <w:pageBreakBefore/>
+      </w:pPr>
+      <w:r>
+        <w:t>A7. Sequence: ingest and failure handling</w:t>
+      </w:r>
+    </w:p>
+    <w:p>
+      <w:pPr>
+        <w:keepLines/>
+        <w:jc w:val="center"/>
+      </w:pPr>
+      <w:r>
+        <w:drawing>
+          <wp:inline xmlns:a="http://schemas.openxmlformats.org/drawingml/2006/main" xmlns:pic="http://schemas.openxmlformats.org/drawingml/2006/picture">
+            <wp:extent cx="9006840" cy="4228436"/>
+            <wp:docPr id="7" name="Picture 7"/>
+            <wp:cNvGraphicFramePr>
+              <a:graphicFrameLocks noChangeAspect="1"/>
+            </wp:cNvGraphicFramePr>
+            <a:graphic>
+              <a:graphicData uri="http://schemas.openxmlformats.org/drawingml/2006/picture">
+                <pic:pic>
+                  <pic:nvPicPr>
+                    <pic:cNvPr id="0" name="07-sequence-ingest-failure.png"/>
+                    <pic:cNvPicPr/>
+                  </pic:nvPicPr>
+                  <pic:blipFill>
+                    <a:blip r:embed="rId17"/>
+                    <a:stretch>
+                      <a:fillRect/>
+                    </a:stretch>
+                  </pic:blipFill>
+                  <pic:spPr>
+                    <a:xfrm>
+                      <a:off x="0" y="0"/>
+                      <a:ext cx="9006840" cy="4228436"/>
+                    </a:xfrm>
+                    <a:prstGeom prst="rect"/>
+                  </pic:spPr>
+                </pic:pic>
+              </a:graphicData>
+            </a:graphic>
+          </wp:inline>
+        </w:drawing>
+      </w:r>
+    </w:p>
+    <w:p>
+      <w:pPr>
+        <w:keepLines/>
+        <w:jc w:val="center"/>
+      </w:pPr>
+      <w:r>
+        <w:t>Kafka acknowledgement, duplicate idempotency, broker unavailable retry, and dead-letter path.</w:t>
+      </w:r>
+    </w:p>
+    <w:p>
+      <w:pPr>
+        <w:pStyle w:val="Heading2"/>
+        <w:keepNext/>
+        <w:pageBreakBefore/>
+      </w:pPr>
+      <w:r>
+        <w:t>A8. Sequence: idle alert lifecycle</w:t>
+      </w:r>
+    </w:p>
+    <w:p>
+      <w:pPr>
+        <w:keepLines/>
+        <w:jc w:val="center"/>
+      </w:pPr>
+      <w:r>
+        <w:drawing>
+          <wp:inline xmlns:a="http://schemas.openxmlformats.org/drawingml/2006/main" xmlns:pic="http://schemas.openxmlformats.org/drawingml/2006/picture">
+            <wp:extent cx="9006840" cy="5178480"/>
+            <wp:docPr id="8" name="Picture 8"/>
+            <wp:cNvGraphicFramePr>
+              <a:graphicFrameLocks noChangeAspect="1"/>
+            </wp:cNvGraphicFramePr>
+            <a:graphic>
+              <a:graphicData uri="http://schemas.openxmlformats.org/drawingml/2006/picture">
+                <pic:pic>
+                  <pic:nvPicPr>
+                    <pic:cNvPr id="0" name="08-sequence-idle-alert.png"/>
+                    <pic:cNvPicPr/>
+                  </pic:nvPicPr>
+                  <pic:blipFill>
+                    <a:blip r:embed="rId18"/>
+                    <a:stretch>
+                      <a:fillRect/>
+                    </a:stretch>
+                  </pic:blipFill>
+                  <pic:spPr>
+                    <a:xfrm>
+                      <a:off x="0" y="0"/>
+                      <a:ext cx="9006840" cy="5178480"/>
+                    </a:xfrm>
+                    <a:prstGeom prst="rect"/>
+                  </pic:spPr>
+                </pic:pic>
+              </a:graphicData>
+            </a:graphic>
+          </wp:inline>
+        </w:drawing>
+      </w:r>
+    </w:p>
+    <w:p>
+      <w:pPr>
+        <w:keepLines/>
+        <w:jc w:val="center"/>
+      </w:pPr>
+      <w:r>
+        <w:t>Idle threshold, persisted alert, dashboard acknowledgement, and later movement resolution.</w:t>
+      </w:r>
+    </w:p>
     <w:sectPr>
-      <w:headerReference w:type="default" r:id="rId7"/>
-      <w:footerReference w:type="default" r:id="rId8"/>
-      <w:pgSz w:w="11906" w:h="16838"/>
-      <w:pgMar w:top="1440" w:right="1300" w:bottom="1300" w:left="1300" w:header="600" w:footer="600" w:gutter="0"/>
+      <w:pgSz w:w="16838" w:h="11906" w:orient="landscape"/>
+      <w:pgMar w:top="1080" w:right="1296" w:bottom="936" w:left="1296" w:header="600" w:footer="600" w:gutter="0"/>
       <w:cols w:space="720"/>
       <w:docGrid w:linePitch="360"/>
     </w:sectPr>

</xml_diff>